<commit_message>
docs: revise teacher report and stabilize Word layout
</commit_message>
<xml_diff>
--- a/docs/cALorie_Teknik_Aciklama_Raporu.docx
+++ b/docs/cALorie_Teknik_Aciklama_Raporu.docx
@@ -34,6 +34,7 @@
     </w:p>
     <w:p>
       <w:pPr>
+        <w:keepNext/>
         <w:jc w:val="center"/>
         <w:widowControl/>
       </w:pPr>
@@ -82,11 +83,11 @@
         <w:rPr>
           <w:b/>
         </w:rPr>
-        <w:t>Hazırlayan</w:t>
+        <w:t>Yıldız Teknik Üniversitesi</w:t>
         <w:br/>
       </w:r>
       <w:r>
-        <w:t>Nurullah Barış Çelik</w:t>
+        <w:t>Bilgisayar Mühendisliği Bölümü</w:t>
         <w:br/>
         <w:br/>
       </w:r>
@@ -94,7 +95,24 @@
         <w:rPr>
           <w:b/>
         </w:rPr>
-        <w:t>Üniversite Yazılım Projesi</w:t>
+        <w:t>Sunulan</w:t>
+        <w:br/>
+      </w:r>
+      <w:r>
+        <w:t>Selami Beyhan</w:t>
+        <w:br/>
+        <w:br/>
+      </w:r>
+      <w:r>
+        <w:rPr>
+          <w:b/>
+        </w:rPr>
+        <w:t>Hazırlayan</w:t>
+        <w:br/>
+      </w:r>
+      <w:r>
+        <w:t>Nurullah Barış Çelik</w:t>
+        <w:br/>
         <w:br/>
       </w:r>
       <w:r>
@@ -117,6 +135,15 @@
       </w:pPr>
       <w:r>
         <w:t>Raporun amacı</w:t>
+      </w:r>
+    </w:p>
+    <w:p>
+      <w:pPr>
+        <w:keepLines w:val="0"/>
+        <w:widowControl/>
+      </w:pPr>
+      <w:r>
+        <w:t>Bu rapor, Yıldız Teknik Üniversitesi Bilgisayar Mühendisliği Bölümü öğrencisi Nurullah Barış Çelik tarafından hazırlanmış ve değerlendirilmek üzere Selami Beyhan'a sunulmuştur.</w:t>
       </w:r>
     </w:p>
     <w:p>
@@ -224,7 +251,7 @@
         <w:widowControl/>
       </w:pPr>
       <w:r>
-        <w:t>8  YOLO ve RetinaNet karşılaştırması</w:t>
+        <w:t>8  Güvenlik ve veri gizliliği</w:t>
       </w:r>
     </w:p>
     <w:p>
@@ -234,17 +261,7 @@
         <w:widowControl/>
       </w:pPr>
       <w:r>
-        <w:t>9  Güvenlik ve veri gizliliği</w:t>
-      </w:r>
-    </w:p>
-    <w:p>
-      <w:pPr>
-        <w:spacing w:after="60"/>
-        <w:ind w:left="283"/>
-        <w:widowControl/>
-      </w:pPr>
-      <w:r>
-        <w:t>10 Sınırlamalar değerlendirme ve geliştirme planı</w:t>
+        <w:t>9  Sınırlamalar değerlendirme ve geliştirme planı</w:t>
       </w:r>
     </w:p>
     <w:p>
@@ -323,6 +340,7 @@
     </w:p>
     <w:p>
       <w:pPr>
+        <w:keepNext/>
         <w:jc w:val="center"/>
         <w:widowControl/>
       </w:pPr>
@@ -1161,6 +1179,7 @@
     </w:p>
     <w:p>
       <w:pPr>
+        <w:keepNext/>
         <w:jc w:val="center"/>
         <w:widowControl/>
       </w:pPr>
@@ -1325,6 +1344,7 @@
     </w:p>
     <w:p>
       <w:pPr>
+        <w:keepNext/>
         <w:jc w:val="center"/>
         <w:widowControl/>
       </w:pPr>
@@ -2797,6 +2817,7 @@
     </w:p>
     <w:p>
       <w:pPr>
+        <w:keepNext/>
         <w:jc w:val="center"/>
         <w:widowControl/>
       </w:pPr>
@@ -4433,469 +4454,7 @@
         <w:widowControl/>
       </w:pPr>
       <w:r>
-        <w:t>8 YOLO ve RetinaNet karşılaştırması</w:t>
-      </w:r>
-    </w:p>
-    <w:p>
-      <w:pPr>
-        <w:keepLines w:val="0"/>
-        <w:widowControl/>
-      </w:pPr>
-      <w:r>
-        <w:t>cALorie mevcut sürümünde YOLO veya RetinaNet kullanmamaktadır. Her ikisi de temel olarak görüntüdeki nesneleri kutularla bulmaya yarayan nesne algılama yaklaşımlarıdır. Bir insan kutusu, diz veya dirseğin ne kadar büküldüğünü tek başına açıklamaz.</w:t>
-      </w:r>
-    </w:p>
-    <w:tbl>
-      <w:tblPr>
-        <w:tblStyle w:val="TableGrid"/>
-        <w:tblW w:type="auto" w:w="0"/>
-        <w:jc w:val="center"/>
-        <w:tblLayout w:type="fixed"/>
-        <w:tblLook w:firstColumn="1" w:firstRow="1" w:lastColumn="0" w:lastRow="0" w:noHBand="0" w:noVBand="1" w:val="04A0"/>
-      </w:tblPr>
-      <w:tblGrid>
-        <w:gridCol w:w="3293"/>
-        <w:gridCol w:w="3293"/>
-        <w:gridCol w:w="3293"/>
-      </w:tblGrid>
-      <w:tr>
-        <w:trPr>
-          <w:tblHeader w:val="true"/>
-          <w:cantSplit/>
-        </w:trPr>
-        <w:tc>
-          <w:tcPr>
-            <w:tcW w:type="dxa" w:w="1728"/>
-            <w:shd w:fill="18324A"/>
-            <w:vAlign w:val="center"/>
-            <w:tcMar>
-              <w:top w:w="110" w:type="dxa"/>
-              <w:start w:w="120" w:type="dxa"/>
-              <w:bottom w:w="110" w:type="dxa"/>
-              <w:end w:w="120" w:type="dxa"/>
-            </w:tcMar>
-            <w:tcBorders>
-              <w:top w:val="single" w:sz="4" w:color="D9D9D9"/>
-              <w:left w:val="single" w:sz="4" w:color="D9D9D9"/>
-              <w:bottom w:val="single" w:sz="4" w:color="D9D9D9"/>
-              <w:right w:val="single" w:sz="4" w:color="D9D9D9"/>
-              <w:insideH w:val="single" w:sz="4" w:color="D9D9D9"/>
-              <w:insideV w:val="single" w:sz="4" w:color="D9D9D9"/>
-            </w:tcBorders>
-          </w:tcPr>
-          <w:p>
-            <w:pPr>
-              <w:jc w:val="center"/>
-            </w:pPr>
-            <w:r>
-              <w:rPr>
-                <w:b/>
-                <w:color w:val="FFFFFF"/>
-                <w:sz w:val="18"/>
-              </w:rPr>
-              <w:t>Yöntem</w:t>
-            </w:r>
-          </w:p>
-        </w:tc>
-        <w:tc>
-          <w:tcPr>
-            <w:tcW w:type="dxa" w:w="2880"/>
-            <w:shd w:fill="18324A"/>
-            <w:vAlign w:val="center"/>
-            <w:tcMar>
-              <w:top w:w="110" w:type="dxa"/>
-              <w:start w:w="120" w:type="dxa"/>
-              <w:bottom w:w="110" w:type="dxa"/>
-              <w:end w:w="120" w:type="dxa"/>
-            </w:tcMar>
-            <w:tcBorders>
-              <w:top w:val="single" w:sz="4" w:color="D9D9D9"/>
-              <w:left w:val="single" w:sz="4" w:color="D9D9D9"/>
-              <w:bottom w:val="single" w:sz="4" w:color="D9D9D9"/>
-              <w:right w:val="single" w:sz="4" w:color="D9D9D9"/>
-              <w:insideH w:val="single" w:sz="4" w:color="D9D9D9"/>
-              <w:insideV w:val="single" w:sz="4" w:color="D9D9D9"/>
-            </w:tcBorders>
-          </w:tcPr>
-          <w:p>
-            <w:pPr>
-              <w:jc w:val="center"/>
-            </w:pPr>
-            <w:r>
-              <w:rPr>
-                <w:b/>
-                <w:color w:val="FFFFFF"/>
-                <w:sz w:val="18"/>
-              </w:rPr>
-              <w:t>Temel çıktı</w:t>
-            </w:r>
-          </w:p>
-        </w:tc>
-        <w:tc>
-          <w:tcPr>
-            <w:tcW w:type="dxa" w:w="4608"/>
-            <w:shd w:fill="18324A"/>
-            <w:vAlign w:val="center"/>
-            <w:tcMar>
-              <w:top w:w="110" w:type="dxa"/>
-              <w:start w:w="120" w:type="dxa"/>
-              <w:bottom w:w="110" w:type="dxa"/>
-              <w:end w:w="120" w:type="dxa"/>
-            </w:tcMar>
-            <w:tcBorders>
-              <w:top w:val="single" w:sz="4" w:color="D9D9D9"/>
-              <w:left w:val="single" w:sz="4" w:color="D9D9D9"/>
-              <w:bottom w:val="single" w:sz="4" w:color="D9D9D9"/>
-              <w:right w:val="single" w:sz="4" w:color="D9D9D9"/>
-              <w:insideH w:val="single" w:sz="4" w:color="D9D9D9"/>
-              <w:insideV w:val="single" w:sz="4" w:color="D9D9D9"/>
-            </w:tcBorders>
-          </w:tcPr>
-          <w:p>
-            <w:pPr>
-              <w:jc w:val="center"/>
-            </w:pPr>
-            <w:r>
-              <w:rPr>
-                <w:b/>
-                <w:color w:val="FFFFFF"/>
-                <w:sz w:val="18"/>
-              </w:rPr>
-              <w:t>cALorie için değerlendirme</w:t>
-            </w:r>
-          </w:p>
-        </w:tc>
-      </w:tr>
-      <w:tr>
-        <w:trPr>
-          <w:cantSplit/>
-        </w:trPr>
-        <w:tc>
-          <w:tcPr>
-            <w:tcW w:type="dxa" w:w="1728"/>
-            <w:vAlign w:val="center"/>
-            <w:tcMar>
-              <w:top w:w="110" w:type="dxa"/>
-              <w:start w:w="120" w:type="dxa"/>
-              <w:bottom w:w="110" w:type="dxa"/>
-              <w:end w:w="120" w:type="dxa"/>
-            </w:tcMar>
-            <w:tcBorders>
-              <w:top w:val="single" w:sz="4" w:color="D9D9D9"/>
-              <w:left w:val="single" w:sz="4" w:color="D9D9D9"/>
-              <w:bottom w:val="single" w:sz="4" w:color="D9D9D9"/>
-              <w:right w:val="single" w:sz="4" w:color="D9D9D9"/>
-              <w:insideH w:val="single" w:sz="4" w:color="D9D9D9"/>
-              <w:insideV w:val="single" w:sz="4" w:color="D9D9D9"/>
-            </w:tcBorders>
-          </w:tcPr>
-          <w:p>
-            <w:pPr>
-              <w:jc w:val="left"/>
-            </w:pPr>
-            <w:r>
-              <w:rPr>
-                <w:color w:val="22282E"/>
-                <w:sz w:val="18"/>
-              </w:rPr>
-              <w:t>YOLO</w:t>
-            </w:r>
-          </w:p>
-        </w:tc>
-        <w:tc>
-          <w:tcPr>
-            <w:tcW w:type="dxa" w:w="2880"/>
-            <w:vAlign w:val="center"/>
-            <w:tcMar>
-              <w:top w:w="110" w:type="dxa"/>
-              <w:start w:w="120" w:type="dxa"/>
-              <w:bottom w:w="110" w:type="dxa"/>
-              <w:end w:w="120" w:type="dxa"/>
-            </w:tcMar>
-            <w:tcBorders>
-              <w:top w:val="single" w:sz="4" w:color="D9D9D9"/>
-              <w:left w:val="single" w:sz="4" w:color="D9D9D9"/>
-              <w:bottom w:val="single" w:sz="4" w:color="D9D9D9"/>
-              <w:right w:val="single" w:sz="4" w:color="D9D9D9"/>
-              <w:insideH w:val="single" w:sz="4" w:color="D9D9D9"/>
-              <w:insideV w:val="single" w:sz="4" w:color="D9D9D9"/>
-            </w:tcBorders>
-          </w:tcPr>
-          <w:p>
-            <w:pPr>
-              <w:jc w:val="left"/>
-            </w:pPr>
-            <w:r>
-              <w:rPr>
-                <w:color w:val="22282E"/>
-                <w:sz w:val="18"/>
-              </w:rPr>
-              <w:t>Nesne kutuları ve sınıfları</w:t>
-            </w:r>
-          </w:p>
-        </w:tc>
-        <w:tc>
-          <w:tcPr>
-            <w:tcW w:type="dxa" w:w="4608"/>
-            <w:vAlign w:val="center"/>
-            <w:tcMar>
-              <w:top w:w="110" w:type="dxa"/>
-              <w:start w:w="120" w:type="dxa"/>
-              <w:bottom w:w="110" w:type="dxa"/>
-              <w:end w:w="120" w:type="dxa"/>
-            </w:tcMar>
-            <w:tcBorders>
-              <w:top w:val="single" w:sz="4" w:color="D9D9D9"/>
-              <w:left w:val="single" w:sz="4" w:color="D9D9D9"/>
-              <w:bottom w:val="single" w:sz="4" w:color="D9D9D9"/>
-              <w:right w:val="single" w:sz="4" w:color="D9D9D9"/>
-              <w:insideH w:val="single" w:sz="4" w:color="D9D9D9"/>
-              <w:insideV w:val="single" w:sz="4" w:color="D9D9D9"/>
-            </w:tcBorders>
-          </w:tcPr>
-          <w:p>
-            <w:pPr>
-              <w:jc w:val="left"/>
-            </w:pPr>
-            <w:r>
-              <w:rPr>
-                <w:color w:val="22282E"/>
-                <w:sz w:val="18"/>
-              </w:rPr>
-              <w:t>İnsan varlığını bulabilir ancak eklem hareketi için tek başına yeterli değildir</w:t>
-            </w:r>
-          </w:p>
-        </w:tc>
-      </w:tr>
-      <w:tr>
-        <w:trPr>
-          <w:cantSplit/>
-        </w:trPr>
-        <w:tc>
-          <w:tcPr>
-            <w:tcW w:type="dxa" w:w="1728"/>
-            <w:shd w:fill="F5F8FA"/>
-            <w:vAlign w:val="center"/>
-            <w:tcMar>
-              <w:top w:w="110" w:type="dxa"/>
-              <w:start w:w="120" w:type="dxa"/>
-              <w:bottom w:w="110" w:type="dxa"/>
-              <w:end w:w="120" w:type="dxa"/>
-            </w:tcMar>
-            <w:tcBorders>
-              <w:top w:val="single" w:sz="4" w:color="D9D9D9"/>
-              <w:left w:val="single" w:sz="4" w:color="D9D9D9"/>
-              <w:bottom w:val="single" w:sz="4" w:color="D9D9D9"/>
-              <w:right w:val="single" w:sz="4" w:color="D9D9D9"/>
-              <w:insideH w:val="single" w:sz="4" w:color="D9D9D9"/>
-              <w:insideV w:val="single" w:sz="4" w:color="D9D9D9"/>
-            </w:tcBorders>
-          </w:tcPr>
-          <w:p>
-            <w:pPr>
-              <w:jc w:val="left"/>
-            </w:pPr>
-            <w:r>
-              <w:rPr>
-                <w:color w:val="22282E"/>
-                <w:sz w:val="18"/>
-              </w:rPr>
-              <w:t>RetinaNet</w:t>
-            </w:r>
-          </w:p>
-        </w:tc>
-        <w:tc>
-          <w:tcPr>
-            <w:tcW w:type="dxa" w:w="2880"/>
-            <w:shd w:fill="F5F8FA"/>
-            <w:vAlign w:val="center"/>
-            <w:tcMar>
-              <w:top w:w="110" w:type="dxa"/>
-              <w:start w:w="120" w:type="dxa"/>
-              <w:bottom w:w="110" w:type="dxa"/>
-              <w:end w:w="120" w:type="dxa"/>
-            </w:tcMar>
-            <w:tcBorders>
-              <w:top w:val="single" w:sz="4" w:color="D9D9D9"/>
-              <w:left w:val="single" w:sz="4" w:color="D9D9D9"/>
-              <w:bottom w:val="single" w:sz="4" w:color="D9D9D9"/>
-              <w:right w:val="single" w:sz="4" w:color="D9D9D9"/>
-              <w:insideH w:val="single" w:sz="4" w:color="D9D9D9"/>
-              <w:insideV w:val="single" w:sz="4" w:color="D9D9D9"/>
-            </w:tcBorders>
-          </w:tcPr>
-          <w:p>
-            <w:pPr>
-              <w:jc w:val="left"/>
-            </w:pPr>
-            <w:r>
-              <w:rPr>
-                <w:color w:val="22282E"/>
-                <w:sz w:val="18"/>
-              </w:rPr>
-              <w:t>Nesne kutuları ve sınıfları</w:t>
-            </w:r>
-          </w:p>
-        </w:tc>
-        <w:tc>
-          <w:tcPr>
-            <w:tcW w:type="dxa" w:w="4608"/>
-            <w:shd w:fill="F5F8FA"/>
-            <w:vAlign w:val="center"/>
-            <w:tcMar>
-              <w:top w:w="110" w:type="dxa"/>
-              <w:start w:w="120" w:type="dxa"/>
-              <w:bottom w:w="110" w:type="dxa"/>
-              <w:end w:w="120" w:type="dxa"/>
-            </w:tcMar>
-            <w:tcBorders>
-              <w:top w:val="single" w:sz="4" w:color="D9D9D9"/>
-              <w:left w:val="single" w:sz="4" w:color="D9D9D9"/>
-              <w:bottom w:val="single" w:sz="4" w:color="D9D9D9"/>
-              <w:right w:val="single" w:sz="4" w:color="D9D9D9"/>
-              <w:insideH w:val="single" w:sz="4" w:color="D9D9D9"/>
-              <w:insideV w:val="single" w:sz="4" w:color="D9D9D9"/>
-            </w:tcBorders>
-          </w:tcPr>
-          <w:p>
-            <w:pPr>
-              <w:jc w:val="left"/>
-            </w:pPr>
-            <w:r>
-              <w:rPr>
-                <w:color w:val="22282E"/>
-                <w:sz w:val="18"/>
-              </w:rPr>
-              <w:t>Nesne algılama odaklıdır; bu projede kullanılmamaktadır</w:t>
-            </w:r>
-          </w:p>
-        </w:tc>
-      </w:tr>
-      <w:tr>
-        <w:trPr>
-          <w:cantSplit/>
-        </w:trPr>
-        <w:tc>
-          <w:tcPr>
-            <w:tcW w:type="dxa" w:w="1728"/>
-            <w:vAlign w:val="center"/>
-            <w:tcMar>
-              <w:top w:w="110" w:type="dxa"/>
-              <w:start w:w="120" w:type="dxa"/>
-              <w:bottom w:w="110" w:type="dxa"/>
-              <w:end w:w="120" w:type="dxa"/>
-            </w:tcMar>
-            <w:tcBorders>
-              <w:top w:val="single" w:sz="4" w:color="D9D9D9"/>
-              <w:left w:val="single" w:sz="4" w:color="D9D9D9"/>
-              <w:bottom w:val="single" w:sz="4" w:color="D9D9D9"/>
-              <w:right w:val="single" w:sz="4" w:color="D9D9D9"/>
-              <w:insideH w:val="single" w:sz="4" w:color="D9D9D9"/>
-              <w:insideV w:val="single" w:sz="4" w:color="D9D9D9"/>
-            </w:tcBorders>
-          </w:tcPr>
-          <w:p>
-            <w:pPr>
-              <w:jc w:val="left"/>
-            </w:pPr>
-            <w:r>
-              <w:rPr>
-                <w:color w:val="22282E"/>
-                <w:sz w:val="18"/>
-              </w:rPr>
-              <w:t>MediaPipe Pose</w:t>
-            </w:r>
-          </w:p>
-        </w:tc>
-        <w:tc>
-          <w:tcPr>
-            <w:tcW w:type="dxa" w:w="2880"/>
-            <w:vAlign w:val="center"/>
-            <w:tcMar>
-              <w:top w:w="110" w:type="dxa"/>
-              <w:start w:w="120" w:type="dxa"/>
-              <w:bottom w:w="110" w:type="dxa"/>
-              <w:end w:w="120" w:type="dxa"/>
-            </w:tcMar>
-            <w:tcBorders>
-              <w:top w:val="single" w:sz="4" w:color="D9D9D9"/>
-              <w:left w:val="single" w:sz="4" w:color="D9D9D9"/>
-              <w:bottom w:val="single" w:sz="4" w:color="D9D9D9"/>
-              <w:right w:val="single" w:sz="4" w:color="D9D9D9"/>
-              <w:insideH w:val="single" w:sz="4" w:color="D9D9D9"/>
-              <w:insideV w:val="single" w:sz="4" w:color="D9D9D9"/>
-            </w:tcBorders>
-          </w:tcPr>
-          <w:p>
-            <w:pPr>
-              <w:jc w:val="left"/>
-            </w:pPr>
-            <w:r>
-              <w:rPr>
-                <w:color w:val="22282E"/>
-                <w:sz w:val="18"/>
-              </w:rPr>
-              <w:t>Vücut landmark koordinatları</w:t>
-            </w:r>
-          </w:p>
-        </w:tc>
-        <w:tc>
-          <w:tcPr>
-            <w:tcW w:type="dxa" w:w="4608"/>
-            <w:vAlign w:val="center"/>
-            <w:tcMar>
-              <w:top w:w="110" w:type="dxa"/>
-              <w:start w:w="120" w:type="dxa"/>
-              <w:bottom w:w="110" w:type="dxa"/>
-              <w:end w:w="120" w:type="dxa"/>
-            </w:tcMar>
-            <w:tcBorders>
-              <w:top w:val="single" w:sz="4" w:color="D9D9D9"/>
-              <w:left w:val="single" w:sz="4" w:color="D9D9D9"/>
-              <w:bottom w:val="single" w:sz="4" w:color="D9D9D9"/>
-              <w:right w:val="single" w:sz="4" w:color="D9D9D9"/>
-              <w:insideH w:val="single" w:sz="4" w:color="D9D9D9"/>
-              <w:insideV w:val="single" w:sz="4" w:color="D9D9D9"/>
-            </w:tcBorders>
-          </w:tcPr>
-          <w:p>
-            <w:pPr>
-              <w:jc w:val="left"/>
-            </w:pPr>
-            <w:r>
-              <w:rPr>
-                <w:color w:val="22282E"/>
-                <w:sz w:val="18"/>
-              </w:rPr>
-              <w:t>Eklem açıları ve hareket döngüleri için doğrudan kullanılabilir veri sağlar</w:t>
-            </w:r>
-          </w:p>
-        </w:tc>
-      </w:tr>
-    </w:tbl>
-    <w:p>
-      <w:pPr>
-        <w:spacing w:after="0"/>
-        <w:widowControl/>
-      </w:pPr>
-    </w:p>
-    <w:p>
-      <w:pPr>
-        <w:keepLines w:val="0"/>
-        <w:widowControl/>
-      </w:pPr>
-      <w:r>
-        <w:t>Projede makine öğrenmesi kullanan temel bileşen MediaPipe Pose modelidir. MediaPipe sonrasındaki egzersiz seçimi, zaman yumuşatma ve tekrar sayma adımları proje için yazılmış geometrik kurallardır. Gelecekte yeterli etiketli video toplanırsa LSTM, TCN veya Transformer gibi zamansal modeller bu kurallarla karşılaştırılabilir.</w:t>
-      </w:r>
-    </w:p>
-    <w:p>
-      <w:pPr>
-        <w:pStyle w:val="Heading1"/>
-        <w:keepNext/>
-        <w:widowControl/>
-      </w:pPr>
-      <w:r>
-        <w:t>9 Güvenlik ve veri gizliliği</w:t>
+        <w:t>8 Güvenlik ve veri gizliliği</w:t>
       </w:r>
     </w:p>
     <w:p>
@@ -4986,7 +4545,7 @@
         <w:widowControl/>
       </w:pPr>
       <w:r>
-        <w:t>10 Sınırlamalar değerlendirme ve geliştirme planı</w:t>
+        <w:t>9 Sınırlamalar değerlendirme ve geliştirme planı</w:t>
       </w:r>
     </w:p>
     <w:p>
@@ -4996,7 +4555,7 @@
         <w:widowControl/>
       </w:pPr>
       <w:r>
-        <w:t>10 1 Mevcut sınırlamalar</w:t>
+        <w:t>9 1 Mevcut sınırlamalar</w:t>
       </w:r>
     </w:p>
     <w:p>
@@ -5069,7 +4628,7 @@
         <w:widowControl/>
       </w:pPr>
       <w:r>
-        <w:t>10 2 Doğru değerlendirme yöntemi</w:t>
+        <w:t>9 2 Doğru değerlendirme yöntemi</w:t>
       </w:r>
     </w:p>
     <w:p>
@@ -5088,7 +4647,7 @@
         <w:widowControl/>
       </w:pPr>
       <w:r>
-        <w:t>10 3 Geliştirme planı</w:t>
+        <w:t>9 3 Geliştirme planı</w:t>
       </w:r>
     </w:p>
     <w:p>
@@ -6495,7 +6054,7 @@
       <w:spacing w:after="140" w:line="269" w:lineRule="auto"/>
     </w:pPr>
     <w:rPr>
-      <w:rFonts w:ascii="Aptos" w:hAnsi="Aptos"/>
+      <w:rFonts w:ascii="Arial" w:hAnsi="Arial" w:eastAsia="Arial" w:cs="Arial"/>
       <w:color w:val="22282E"/>
       <w:sz w:val="21"/>
     </w:rPr>
@@ -6559,7 +6118,7 @@
       <w:outlineLvl w:val="0"/>
     </w:pPr>
     <w:rPr>
-      <w:rFonts w:asciiTheme="majorHAnsi" w:eastAsiaTheme="majorEastAsia" w:hAnsiTheme="majorHAnsi" w:cstheme="majorBidi" w:ascii="Aptos Display" w:hAnsi="Aptos Display"/>
+      <w:rFonts w:asciiTheme="majorHAnsi" w:eastAsiaTheme="majorEastAsia" w:hAnsiTheme="majorHAnsi" w:cstheme="majorBidi" w:ascii="Arial" w:hAnsi="Arial" w:eastAsia="Arial" w:cs="Arial"/>
       <w:b/>
       <w:bCs/>
       <w:color w:val="000000"/>
@@ -6583,7 +6142,7 @@
       <w:outlineLvl w:val="1"/>
     </w:pPr>
     <w:rPr>
-      <w:rFonts w:asciiTheme="majorHAnsi" w:eastAsiaTheme="majorEastAsia" w:hAnsiTheme="majorHAnsi" w:cstheme="majorBidi" w:ascii="Aptos Display" w:hAnsi="Aptos Display"/>
+      <w:rFonts w:asciiTheme="majorHAnsi" w:eastAsiaTheme="majorEastAsia" w:hAnsiTheme="majorHAnsi" w:cstheme="majorBidi" w:ascii="Arial" w:hAnsi="Arial" w:eastAsia="Arial" w:cs="Arial"/>
       <w:b/>
       <w:bCs/>
       <w:color w:val="000000"/>
@@ -6607,7 +6166,7 @@
       <w:outlineLvl w:val="2"/>
     </w:pPr>
     <w:rPr>
-      <w:rFonts w:asciiTheme="majorHAnsi" w:eastAsiaTheme="majorEastAsia" w:hAnsiTheme="majorHAnsi" w:cstheme="majorBidi" w:ascii="Aptos Display" w:hAnsi="Aptos Display"/>
+      <w:rFonts w:asciiTheme="majorHAnsi" w:eastAsiaTheme="majorEastAsia" w:hAnsiTheme="majorHAnsi" w:cstheme="majorBidi" w:ascii="Arial" w:hAnsi="Arial" w:eastAsia="Arial" w:cs="Arial"/>
       <w:b/>
       <w:bCs/>
       <w:color w:val="000000"/>
@@ -6846,7 +6405,7 @@
       <w:contextualSpacing/>
     </w:pPr>
     <w:rPr>
-      <w:rFonts w:asciiTheme="majorHAnsi" w:eastAsiaTheme="majorEastAsia" w:hAnsiTheme="majorHAnsi" w:cstheme="majorBidi" w:ascii="Aptos Display" w:hAnsi="Aptos Display"/>
+      <w:rFonts w:asciiTheme="majorHAnsi" w:eastAsiaTheme="majorEastAsia" w:hAnsiTheme="majorHAnsi" w:cstheme="majorBidi" w:ascii="Arial" w:hAnsi="Arial" w:eastAsia="Arial" w:cs="Arial"/>
       <w:b/>
       <w:color w:val="000000"/>
       <w:spacing w:val="5"/>
@@ -18187,7 +17746,7 @@
       <w:spacing w:before="60" w:after="200"/>
     </w:pPr>
     <w:rPr>
-      <w:rFonts w:ascii="Aptos" w:hAnsi="Aptos"/>
+      <w:rFonts w:ascii="Arial" w:hAnsi="Arial" w:eastAsia="Arial" w:cs="Arial"/>
       <w:i/>
       <w:color w:val="5A656E"/>
       <w:sz w:val="18"/>

</xml_diff>